<commit_message>
feat(sprint1): Complete Sprint 1 - Mobile app + Backend fixes + Cleanup
MOBILE APP (NEW):
- ✅ 9 screens with Expo Router
- ✅ All 7 User Stories implemented
- ✅ Medical History bonus feature
- ✅ DateTimePicker integration
- ✅ API integration with auth
- ✅ Pull-to-refresh, search, filter
- ✅ Empty states with CTA buttons
- ✅ Debug token screen

BACKEND FIXES:
- ✅ DoctorsController null-safe fixes
- ✅ Consistent PublicId/FullName format
- ✅ Fixed 500 error on doctor detail

BUG FIXES:
- ✅ Appointments interface compatibility
- ✅ Medical History interface updated
- ✅ Enhanced error handling (401/404)
- ✅ Removed unnecessary alerts

SCRIPTS ADDED:
- ✅ start-dev.ps1 (dev server)
- ✅ install-datetimepicker.ps1
- ✅ restart-backend.ps1
- ✅ test-mobile-connection.ps1
- ✅ update-ip.ps1
- ✅ cleanup-project.ps1

DOCUMENTATION:
- ✅ SPRINT1_COMPLETION_REPORT.md
- ✅ TESTING_GUIDE.md
- ✅ README_SPRINT1.md
- ✅ Cleaned up 33 temp/debug files

Sprint 1: 12/12 tasks (100%)
Ready for demo and Sprint 2!
</commit_message>
<xml_diff>
--- a/Docs/Sprint_Planning_S1.docx
+++ b/Docs/Sprint_Planning_S1.docx
@@ -107,6 +107,7 @@
                 <w:szCs w:val="24"/>
               </w:rPr>
             </w:pPr>
+            <w:bookmarkStart w:id="0" w:name="_Hlk210257782"/>
             <w:r>
               <w:rPr>
                 <w:rFonts w:ascii="Times New Roman" w:eastAsia="Times New Roman" w:hAnsi="Times New Roman" w:cs="Times New Roman"/>
@@ -135,6 +136,7 @@
                 <w:lang w:val="vi-VN"/>
               </w:rPr>
             </w:pPr>
+            <w:bookmarkStart w:id="1" w:name="_Hlk210257795"/>
             <w:r>
               <w:rPr>
                 <w:rFonts w:ascii="Times New Roman" w:eastAsia="Times New Roman" w:hAnsi="Times New Roman" w:cs="Times New Roman"/>
@@ -143,7 +145,7 @@
                 <w:sz w:val="24"/>
                 <w:szCs w:val="24"/>
               </w:rPr>
-              <w:t>27</w:t>
+              <w:t>17</w:t>
             </w:r>
             <w:r>
               <w:rPr>
@@ -156,9 +158,11 @@
               </w:rPr>
               <w:t>/9/2025</w:t>
             </w:r>
+            <w:bookmarkEnd w:id="1"/>
           </w:p>
         </w:tc>
       </w:tr>
+      <w:bookmarkEnd w:id="0"/>
       <w:tr>
         <w:tc>
           <w:tcPr>
@@ -200,8 +204,32 @@
                 <w:bCs/>
                 <w:sz w:val="24"/>
                 <w:szCs w:val="24"/>
-              </w:rPr>
-            </w:pPr>
+                <w:lang w:val="vi-VN"/>
+              </w:rPr>
+            </w:pPr>
+            <w:bookmarkStart w:id="2" w:name="_Hlk210257809"/>
+            <w:r>
+              <w:rPr>
+                <w:rFonts w:ascii="Times New Roman" w:eastAsia="Times New Roman" w:hAnsi="Times New Roman" w:cs="Times New Roman"/>
+                <w:b/>
+                <w:bCs/>
+                <w:sz w:val="24"/>
+                <w:szCs w:val="24"/>
+              </w:rPr>
+              <w:t>30</w:t>
+            </w:r>
+            <w:r>
+              <w:rPr>
+                <w:rFonts w:ascii="Times New Roman" w:eastAsia="Times New Roman" w:hAnsi="Times New Roman" w:cs="Times New Roman"/>
+                <w:b/>
+                <w:bCs/>
+                <w:sz w:val="24"/>
+                <w:szCs w:val="24"/>
+                <w:lang w:val="vi-VN"/>
+              </w:rPr>
+              <w:t>/9/2025</w:t>
+            </w:r>
+            <w:bookmarkEnd w:id="2"/>
           </w:p>
         </w:tc>
       </w:tr>
@@ -652,6 +680,7 @@
                 <w:lang w:val="vi-VN"/>
               </w:rPr>
             </w:pPr>
+            <w:bookmarkStart w:id="3" w:name="_Hlk210258875"/>
             <w:r>
               <w:rPr>
                 <w:rFonts w:ascii="Times New Roman" w:eastAsia="Times New Roman" w:hAnsi="Times New Roman" w:cs="Times New Roman"/>
@@ -668,6 +697,7 @@
               </w:rPr>
               <w:t>chủ</w:t>
             </w:r>
+            <w:bookmarkEnd w:id="3"/>
             <w:r>
               <w:rPr>
                 <w:rFonts w:ascii="Times New Roman" w:eastAsia="Times New Roman" w:hAnsi="Times New Roman" w:cs="Times New Roman"/>
@@ -779,7 +809,7 @@
                 <w:sz w:val="24"/>
                 <w:szCs w:val="24"/>
               </w:rPr>
-              <w:t>To Do</w:t>
+              <w:t>Done</w:t>
             </w:r>
           </w:p>
         </w:tc>
@@ -830,6 +860,7 @@
                 <w:lang w:val="vi-VN"/>
               </w:rPr>
             </w:pPr>
+            <w:bookmarkStart w:id="4" w:name="_Hlk210258902"/>
             <w:r>
               <w:rPr>
                 <w:rFonts w:ascii="Times New Roman" w:eastAsia="Times New Roman" w:hAnsi="Times New Roman" w:cs="Times New Roman"/>
@@ -846,7 +877,17 @@
                 <w:szCs w:val="24"/>
                 <w:lang w:val="vi-VN"/>
               </w:rPr>
-              <w:t>khám.</w:t>
+              <w:t>khám</w:t>
+            </w:r>
+            <w:bookmarkEnd w:id="4"/>
+            <w:r>
+              <w:rPr>
+                <w:rFonts w:ascii="Times New Roman" w:eastAsia="Times New Roman" w:hAnsi="Times New Roman" w:cs="Times New Roman"/>
+                <w:sz w:val="24"/>
+                <w:szCs w:val="24"/>
+                <w:lang w:val="vi-VN"/>
+              </w:rPr>
+              <w:t>.</w:t>
             </w:r>
           </w:p>
         </w:tc>
@@ -951,7 +992,7 @@
                 <w:sz w:val="24"/>
                 <w:szCs w:val="24"/>
               </w:rPr>
-              <w:t>To Do</w:t>
+              <w:t>Done</w:t>
             </w:r>
           </w:p>
         </w:tc>
@@ -1009,6 +1050,7 @@
                 <w:lang w:val="vi-VN"/>
               </w:rPr>
             </w:pPr>
+            <w:bookmarkStart w:id="5" w:name="_Hlk210258910"/>
             <w:r>
               <w:rPr>
                 <w:rFonts w:ascii="Times New Roman" w:eastAsia="Times New Roman" w:hAnsi="Times New Roman" w:cs="Times New Roman"/>
@@ -1025,7 +1067,17 @@
                 <w:szCs w:val="24"/>
                 <w:lang w:val="vi-VN"/>
               </w:rPr>
-              <w:t>tuyến.</w:t>
+              <w:t>tuyến</w:t>
+            </w:r>
+            <w:bookmarkEnd w:id="5"/>
+            <w:r>
+              <w:rPr>
+                <w:rFonts w:ascii="Times New Roman" w:eastAsia="Times New Roman" w:hAnsi="Times New Roman" w:cs="Times New Roman"/>
+                <w:sz w:val="24"/>
+                <w:szCs w:val="24"/>
+                <w:lang w:val="vi-VN"/>
+              </w:rPr>
+              <w:t>.</w:t>
             </w:r>
           </w:p>
         </w:tc>
@@ -1128,7 +1180,7 @@
                 <w:sz w:val="24"/>
                 <w:szCs w:val="24"/>
               </w:rPr>
-              <w:t>To Do</w:t>
+              <w:t>Done</w:t>
             </w:r>
           </w:p>
         </w:tc>
@@ -1186,6 +1238,7 @@
                 <w:lang w:val="vi-VN"/>
               </w:rPr>
             </w:pPr>
+            <w:bookmarkStart w:id="6" w:name="_Hlk210258920"/>
             <w:r>
               <w:rPr>
                 <w:rFonts w:ascii="Times New Roman" w:eastAsia="Times New Roman" w:hAnsi="Times New Roman" w:cs="Times New Roman"/>
@@ -1202,6 +1255,7 @@
               </w:rPr>
               <w:t>khoản</w:t>
             </w:r>
+            <w:bookmarkEnd w:id="6"/>
             <w:r>
               <w:rPr>
                 <w:rFonts w:ascii="Times New Roman" w:eastAsia="Times New Roman" w:hAnsi="Times New Roman" w:cs="Times New Roman"/>
@@ -1328,7 +1382,7 @@
                 <w:sz w:val="24"/>
                 <w:szCs w:val="24"/>
               </w:rPr>
-              <w:t>To Do</w:t>
+              <w:t>Done</w:t>
             </w:r>
           </w:p>
         </w:tc>
@@ -1386,6 +1440,7 @@
                 <w:lang w:val="vi-VN"/>
               </w:rPr>
             </w:pPr>
+            <w:bookmarkStart w:id="7" w:name="_Hlk210258930"/>
             <w:r>
               <w:rPr>
                 <w:rFonts w:ascii="Times New Roman" w:eastAsia="Times New Roman" w:hAnsi="Times New Roman" w:cs="Times New Roman"/>
@@ -1402,7 +1457,17 @@
                 <w:szCs w:val="24"/>
                 <w:lang w:val="vi-VN"/>
               </w:rPr>
-              <w:t>khám.</w:t>
+              <w:t>khám</w:t>
+            </w:r>
+            <w:bookmarkEnd w:id="7"/>
+            <w:r>
+              <w:rPr>
+                <w:rFonts w:ascii="Times New Roman" w:eastAsia="Times New Roman" w:hAnsi="Times New Roman" w:cs="Times New Roman"/>
+                <w:sz w:val="24"/>
+                <w:szCs w:val="24"/>
+                <w:lang w:val="vi-VN"/>
+              </w:rPr>
+              <w:t>.</w:t>
             </w:r>
           </w:p>
         </w:tc>
@@ -1505,7 +1570,7 @@
                 <w:sz w:val="24"/>
                 <w:szCs w:val="24"/>
               </w:rPr>
-              <w:t>To Do</w:t>
+              <w:t>Done</w:t>
             </w:r>
           </w:p>
         </w:tc>
@@ -1563,6 +1628,7 @@
                 <w:lang w:val="vi-VN"/>
               </w:rPr>
             </w:pPr>
+            <w:bookmarkStart w:id="8" w:name="_Hlk210258939"/>
             <w:r>
               <w:rPr>
                 <w:rFonts w:ascii="Times New Roman" w:eastAsia="Times New Roman" w:hAnsi="Times New Roman" w:cs="Times New Roman"/>
@@ -1579,7 +1645,17 @@
                 <w:szCs w:val="24"/>
                 <w:lang w:val="vi-VN"/>
               </w:rPr>
-              <w:t>sĩ.</w:t>
+              <w:t>sĩ</w:t>
+            </w:r>
+            <w:bookmarkEnd w:id="8"/>
+            <w:r>
+              <w:rPr>
+                <w:rFonts w:ascii="Times New Roman" w:eastAsia="Times New Roman" w:hAnsi="Times New Roman" w:cs="Times New Roman"/>
+                <w:sz w:val="24"/>
+                <w:szCs w:val="24"/>
+                <w:lang w:val="vi-VN"/>
+              </w:rPr>
+              <w:t>.</w:t>
             </w:r>
           </w:p>
         </w:tc>
@@ -1681,7 +1757,7 @@
                 <w:sz w:val="24"/>
                 <w:szCs w:val="24"/>
               </w:rPr>
-              <w:t>To Do</w:t>
+              <w:t>Done</w:t>
             </w:r>
           </w:p>
         </w:tc>
@@ -1739,6 +1815,7 @@
                 <w:lang w:val="vi-VN"/>
               </w:rPr>
             </w:pPr>
+            <w:bookmarkStart w:id="9" w:name="_Hlk210258949"/>
             <w:r>
               <w:rPr>
                 <w:rFonts w:ascii="Times New Roman" w:eastAsia="Times New Roman" w:hAnsi="Times New Roman" w:cs="Times New Roman"/>
@@ -1755,7 +1832,17 @@
                 <w:szCs w:val="24"/>
                 <w:lang w:val="vi-VN"/>
               </w:rPr>
-              <w:t>khám.</w:t>
+              <w:t>khám</w:t>
+            </w:r>
+            <w:bookmarkEnd w:id="9"/>
+            <w:r>
+              <w:rPr>
+                <w:rFonts w:ascii="Times New Roman" w:eastAsia="Times New Roman" w:hAnsi="Times New Roman" w:cs="Times New Roman"/>
+                <w:sz w:val="24"/>
+                <w:szCs w:val="24"/>
+                <w:lang w:val="vi-VN"/>
+              </w:rPr>
+              <w:t>.</w:t>
             </w:r>
           </w:p>
         </w:tc>
@@ -1857,12 +1944,40 @@
                 <w:sz w:val="24"/>
                 <w:szCs w:val="24"/>
               </w:rPr>
-              <w:t>To Do</w:t>
+              <w:t>Done</w:t>
             </w:r>
           </w:p>
         </w:tc>
       </w:tr>
     </w:tbl>
+    <w:p>
+      <w:pPr>
+        <w:spacing w:before="100" w:beforeAutospacing="1" w:after="100" w:afterAutospacing="1" w:line="240" w:lineRule="auto"/>
+        <w:outlineLvl w:val="2"/>
+        <w:rPr>
+          <w:rFonts w:ascii="Times New Roman" w:eastAsia="Times New Roman" w:hAnsi="Times New Roman" w:cs="Times New Roman"/>
+          <w:b/>
+          <w:bCs/>
+          <w:sz w:val="27"/>
+          <w:szCs w:val="27"/>
+          <w:lang w:val="vi-VN"/>
+        </w:rPr>
+      </w:pPr>
+    </w:p>
+    <w:p>
+      <w:pPr>
+        <w:spacing w:before="100" w:beforeAutospacing="1" w:after="100" w:afterAutospacing="1" w:line="240" w:lineRule="auto"/>
+        <w:outlineLvl w:val="2"/>
+        <w:rPr>
+          <w:rFonts w:ascii="Times New Roman" w:eastAsia="Times New Roman" w:hAnsi="Times New Roman" w:cs="Times New Roman"/>
+          <w:b/>
+          <w:bCs/>
+          <w:sz w:val="27"/>
+          <w:szCs w:val="27"/>
+          <w:lang w:val="vi-VN"/>
+        </w:rPr>
+      </w:pPr>
+    </w:p>
     <w:p>
       <w:pPr>
         <w:spacing w:before="100" w:beforeAutospacing="1" w:after="100" w:afterAutospacing="1" w:line="240" w:lineRule="auto"/>
@@ -1885,6 +2000,7 @@
           <w:szCs w:val="27"/>
           <w:lang w:val="vi-VN"/>
         </w:rPr>
+        <w:lastRenderedPageBreak/>
         <w:t>3. Phân công công việc chi tiết</w:t>
       </w:r>
     </w:p>
@@ -1945,7 +2061,6 @@
                 <w:sz w:val="24"/>
                 <w:szCs w:val="24"/>
               </w:rPr>
-              <w:lastRenderedPageBreak/>
               <w:t>Công việc</w:t>
             </w:r>
           </w:p>
@@ -2128,15 +2243,17 @@
                 <w:rFonts w:ascii="Times New Roman" w:eastAsia="Times New Roman" w:hAnsi="Times New Roman" w:cs="Times New Roman"/>
                 <w:sz w:val="24"/>
                 <w:szCs w:val="24"/>
-              </w:rPr>
-            </w:pPr>
-            <w:r>
-              <w:rPr>
-                <w:rFonts w:ascii="Times New Roman" w:eastAsia="Times New Roman" w:hAnsi="Times New Roman" w:cs="Times New Roman"/>
-                <w:sz w:val="24"/>
-                <w:szCs w:val="24"/>
-              </w:rPr>
-              <w:t>…</w:t>
+                <w:lang w:val="vi-VN"/>
+              </w:rPr>
+            </w:pPr>
+            <w:r>
+              <w:rPr>
+                <w:rFonts w:ascii="Times New Roman" w:eastAsia="Times New Roman" w:hAnsi="Times New Roman" w:cs="Times New Roman"/>
+                <w:sz w:val="24"/>
+                <w:szCs w:val="24"/>
+                <w:lang w:val="vi-VN"/>
+              </w:rPr>
+              <w:t>30/9/2025</w:t>
             </w:r>
           </w:p>
         </w:tc>
@@ -2161,7 +2278,7 @@
                 <w:sz w:val="24"/>
                 <w:szCs w:val="24"/>
               </w:rPr>
-              <w:t>…</w:t>
+              <w:t>Vanilla JavaScript + HTML5 + CSS3</w:t>
             </w:r>
           </w:p>
         </w:tc>
@@ -2250,6 +2367,15 @@
                 <w:szCs w:val="24"/>
               </w:rPr>
             </w:pPr>
+            <w:r>
+              <w:rPr>
+                <w:rFonts w:ascii="Times New Roman" w:eastAsia="Times New Roman" w:hAnsi="Times New Roman" w:cs="Times New Roman"/>
+                <w:sz w:val="24"/>
+                <w:szCs w:val="24"/>
+                <w:lang w:val="vi-VN"/>
+              </w:rPr>
+              <w:t>30/9/2025</w:t>
+            </w:r>
           </w:p>
         </w:tc>
         <w:tc>
@@ -2266,6 +2392,14 @@
                 <w:szCs w:val="24"/>
               </w:rPr>
             </w:pPr>
+            <w:r>
+              <w:rPr>
+                <w:rFonts w:ascii="Times New Roman" w:eastAsia="Times New Roman" w:hAnsi="Times New Roman" w:cs="Times New Roman"/>
+                <w:sz w:val="24"/>
+                <w:szCs w:val="24"/>
+              </w:rPr>
+              <w:t>Vanilla JavaScript + HTML5 + CSS3</w:t>
+            </w:r>
           </w:p>
         </w:tc>
       </w:tr>
@@ -2353,6 +2487,15 @@
                 <w:szCs w:val="24"/>
               </w:rPr>
             </w:pPr>
+            <w:r>
+              <w:rPr>
+                <w:rFonts w:ascii="Times New Roman" w:eastAsia="Times New Roman" w:hAnsi="Times New Roman" w:cs="Times New Roman"/>
+                <w:sz w:val="24"/>
+                <w:szCs w:val="24"/>
+                <w:lang w:val="vi-VN"/>
+              </w:rPr>
+              <w:t>30/9/2025</w:t>
+            </w:r>
           </w:p>
         </w:tc>
         <w:tc>
@@ -2369,6 +2512,14 @@
                 <w:szCs w:val="24"/>
               </w:rPr>
             </w:pPr>
+            <w:r>
+              <w:rPr>
+                <w:rFonts w:ascii="Times New Roman" w:eastAsia="Times New Roman" w:hAnsi="Times New Roman" w:cs="Times New Roman"/>
+                <w:sz w:val="24"/>
+                <w:szCs w:val="24"/>
+              </w:rPr>
+              <w:t>Vanilla JavaScript + HTML5 + CSS3</w:t>
+            </w:r>
           </w:p>
         </w:tc>
       </w:tr>
@@ -2456,6 +2607,15 @@
                 <w:szCs w:val="24"/>
               </w:rPr>
             </w:pPr>
+            <w:r>
+              <w:rPr>
+                <w:rFonts w:ascii="Times New Roman" w:eastAsia="Times New Roman" w:hAnsi="Times New Roman" w:cs="Times New Roman"/>
+                <w:sz w:val="24"/>
+                <w:szCs w:val="24"/>
+                <w:lang w:val="vi-VN"/>
+              </w:rPr>
+              <w:t>30/9/2025</w:t>
+            </w:r>
           </w:p>
         </w:tc>
         <w:tc>
@@ -2472,6 +2632,14 @@
                 <w:szCs w:val="24"/>
               </w:rPr>
             </w:pPr>
+            <w:r>
+              <w:rPr>
+                <w:rFonts w:ascii="Times New Roman" w:eastAsia="Times New Roman" w:hAnsi="Times New Roman" w:cs="Times New Roman"/>
+                <w:sz w:val="24"/>
+                <w:szCs w:val="24"/>
+              </w:rPr>
+              <w:t>Vanilla JavaScript + HTML5 + CSS3</w:t>
+            </w:r>
           </w:p>
         </w:tc>
       </w:tr>
@@ -2559,6 +2727,15 @@
                 <w:szCs w:val="24"/>
               </w:rPr>
             </w:pPr>
+            <w:r>
+              <w:rPr>
+                <w:rFonts w:ascii="Times New Roman" w:eastAsia="Times New Roman" w:hAnsi="Times New Roman" w:cs="Times New Roman"/>
+                <w:sz w:val="24"/>
+                <w:szCs w:val="24"/>
+                <w:lang w:val="vi-VN"/>
+              </w:rPr>
+              <w:t>30/9/2025</w:t>
+            </w:r>
           </w:p>
         </w:tc>
         <w:tc>
@@ -2575,6 +2752,14 @@
                 <w:szCs w:val="24"/>
               </w:rPr>
             </w:pPr>
+            <w:r>
+              <w:rPr>
+                <w:rFonts w:ascii="Times New Roman" w:eastAsia="Times New Roman" w:hAnsi="Times New Roman" w:cs="Times New Roman"/>
+                <w:sz w:val="24"/>
+                <w:szCs w:val="24"/>
+              </w:rPr>
+              <w:t>Vanilla JavaScript + HTML5 + CSS3</w:t>
+            </w:r>
           </w:p>
         </w:tc>
       </w:tr>
@@ -2662,6 +2847,15 @@
                 <w:szCs w:val="24"/>
               </w:rPr>
             </w:pPr>
+            <w:r>
+              <w:rPr>
+                <w:rFonts w:ascii="Times New Roman" w:eastAsia="Times New Roman" w:hAnsi="Times New Roman" w:cs="Times New Roman"/>
+                <w:sz w:val="24"/>
+                <w:szCs w:val="24"/>
+                <w:lang w:val="vi-VN"/>
+              </w:rPr>
+              <w:t>30/9/2025</w:t>
+            </w:r>
           </w:p>
         </w:tc>
         <w:tc>
@@ -2678,6 +2872,14 @@
                 <w:szCs w:val="24"/>
               </w:rPr>
             </w:pPr>
+            <w:r>
+              <w:rPr>
+                <w:rFonts w:ascii="Times New Roman" w:eastAsia="Times New Roman" w:hAnsi="Times New Roman" w:cs="Times New Roman"/>
+                <w:sz w:val="24"/>
+                <w:szCs w:val="24"/>
+              </w:rPr>
+              <w:t>Vanilla JavaScript + HTML5 + CSS3</w:t>
+            </w:r>
           </w:p>
         </w:tc>
       </w:tr>
@@ -2765,6 +2967,15 @@
                 <w:szCs w:val="24"/>
               </w:rPr>
             </w:pPr>
+            <w:r>
+              <w:rPr>
+                <w:rFonts w:ascii="Times New Roman" w:eastAsia="Times New Roman" w:hAnsi="Times New Roman" w:cs="Times New Roman"/>
+                <w:sz w:val="24"/>
+                <w:szCs w:val="24"/>
+                <w:lang w:val="vi-VN"/>
+              </w:rPr>
+              <w:t>30/9/2025</w:t>
+            </w:r>
           </w:p>
         </w:tc>
         <w:tc>
@@ -2781,6 +2992,14 @@
                 <w:szCs w:val="24"/>
               </w:rPr>
             </w:pPr>
+            <w:r>
+              <w:rPr>
+                <w:rFonts w:ascii="Times New Roman" w:eastAsia="Times New Roman" w:hAnsi="Times New Roman" w:cs="Times New Roman"/>
+                <w:sz w:val="24"/>
+                <w:szCs w:val="24"/>
+              </w:rPr>
+              <w:t>Vanilla JavaScript + HTML5 + CSS3</w:t>
+            </w:r>
           </w:p>
         </w:tc>
       </w:tr>
@@ -2819,7 +3038,16 @@
                 <w:szCs w:val="24"/>
                 <w:lang w:val="vi-VN"/>
               </w:rPr>
-              <w:t xml:space="preserve"> quan đến tạo tài khoản</w:t>
+              <w:t xml:space="preserve"> quan đến </w:t>
+            </w:r>
+            <w:r>
+              <w:rPr>
+                <w:rFonts w:ascii="Times New Roman" w:eastAsia="Times New Roman" w:hAnsi="Times New Roman" w:cs="Times New Roman"/>
+                <w:sz w:val="24"/>
+                <w:szCs w:val="24"/>
+                <w:lang w:val="vi-VN"/>
+              </w:rPr>
+              <w:t>Đăng ký</w:t>
             </w:r>
           </w:p>
         </w:tc>
@@ -2878,8 +3106,9 @@
                 <w:rFonts w:ascii="Times New Roman" w:eastAsia="Times New Roman" w:hAnsi="Times New Roman" w:cs="Times New Roman"/>
                 <w:sz w:val="24"/>
                 <w:szCs w:val="24"/>
-              </w:rPr>
-              <w:t>…</w:t>
+                <w:lang w:val="vi-VN"/>
+              </w:rPr>
+              <w:t>30/9/2025</w:t>
             </w:r>
           </w:p>
         </w:tc>
@@ -2904,7 +3133,622 @@
                 <w:sz w:val="24"/>
                 <w:szCs w:val="24"/>
               </w:rPr>
-              <w:t>…</w:t>
+              <w:t>ASP.NET Core Web API (C#)</w:t>
+            </w:r>
+          </w:p>
+        </w:tc>
+      </w:tr>
+      <w:tr>
+        <w:trPr>
+          <w:tblCellSpacing w:w="15" w:type="dxa"/>
+        </w:trPr>
+        <w:tc>
+          <w:tcPr>
+            <w:tcW w:w="1935" w:type="dxa"/>
+            <w:vAlign w:val="center"/>
+          </w:tcPr>
+          <w:p>
+            <w:pPr>
+              <w:spacing w:after="0" w:line="240" w:lineRule="auto"/>
+              <w:rPr>
+                <w:rFonts w:ascii="Times New Roman" w:eastAsia="Times New Roman" w:hAnsi="Times New Roman" w:cs="Times New Roman"/>
+                <w:sz w:val="24"/>
+                <w:szCs w:val="24"/>
+                <w:lang w:val="vi-VN"/>
+              </w:rPr>
+            </w:pPr>
+            <w:r>
+              <w:rPr>
+                <w:rFonts w:ascii="Times New Roman" w:eastAsia="Times New Roman" w:hAnsi="Times New Roman" w:cs="Times New Roman"/>
+                <w:sz w:val="24"/>
+                <w:szCs w:val="24"/>
+              </w:rPr>
+              <w:t>Viết</w:t>
+            </w:r>
+            <w:r>
+              <w:rPr>
+                <w:rFonts w:ascii="Times New Roman" w:eastAsia="Times New Roman" w:hAnsi="Times New Roman" w:cs="Times New Roman"/>
+                <w:sz w:val="24"/>
+                <w:szCs w:val="24"/>
+                <w:lang w:val="vi-VN"/>
+              </w:rPr>
+              <w:t xml:space="preserve"> API liên quan đến Đăng nhập</w:t>
+            </w:r>
+          </w:p>
+        </w:tc>
+        <w:tc>
+          <w:tcPr>
+            <w:tcW w:w="2663" w:type="dxa"/>
+            <w:vAlign w:val="center"/>
+          </w:tcPr>
+          <w:p>
+            <w:pPr>
+              <w:spacing w:after="0" w:line="240" w:lineRule="auto"/>
+              <w:rPr>
+                <w:rFonts w:ascii="Times New Roman" w:eastAsia="Times New Roman" w:hAnsi="Times New Roman" w:cs="Times New Roman"/>
+                <w:sz w:val="24"/>
+                <w:szCs w:val="24"/>
+                <w:lang w:val="vi-VN"/>
+              </w:rPr>
+            </w:pPr>
+            <w:r>
+              <w:rPr>
+                <w:rFonts w:ascii="Times New Roman" w:eastAsia="Times New Roman" w:hAnsi="Times New Roman" w:cs="Times New Roman"/>
+                <w:sz w:val="24"/>
+                <w:szCs w:val="24"/>
+              </w:rPr>
+              <w:t>Quốc</w:t>
+            </w:r>
+            <w:r>
+              <w:rPr>
+                <w:rFonts w:ascii="Times New Roman" w:eastAsia="Times New Roman" w:hAnsi="Times New Roman" w:cs="Times New Roman"/>
+                <w:sz w:val="24"/>
+                <w:szCs w:val="24"/>
+                <w:lang w:val="vi-VN"/>
+              </w:rPr>
+              <w:t xml:space="preserve"> Hưng</w:t>
+            </w:r>
+          </w:p>
+        </w:tc>
+        <w:tc>
+          <w:tcPr>
+            <w:tcW w:w="1388" w:type="dxa"/>
+            <w:vAlign w:val="center"/>
+          </w:tcPr>
+          <w:p>
+            <w:pPr>
+              <w:spacing w:after="0" w:line="240" w:lineRule="auto"/>
+              <w:rPr>
+                <w:rFonts w:ascii="Times New Roman" w:eastAsia="Times New Roman" w:hAnsi="Times New Roman" w:cs="Times New Roman"/>
+                <w:sz w:val="24"/>
+                <w:szCs w:val="24"/>
+                <w:lang w:val="vi-VN"/>
+              </w:rPr>
+            </w:pPr>
+            <w:r>
+              <w:rPr>
+                <w:rFonts w:ascii="Times New Roman" w:eastAsia="Times New Roman" w:hAnsi="Times New Roman" w:cs="Times New Roman"/>
+                <w:sz w:val="24"/>
+                <w:szCs w:val="24"/>
+                <w:lang w:val="vi-VN"/>
+              </w:rPr>
+              <w:t>30/9/2025</w:t>
+            </w:r>
+          </w:p>
+        </w:tc>
+        <w:tc>
+          <w:tcPr>
+            <w:tcW w:w="2790" w:type="dxa"/>
+            <w:vAlign w:val="center"/>
+          </w:tcPr>
+          <w:p>
+            <w:pPr>
+              <w:spacing w:after="0" w:line="240" w:lineRule="auto"/>
+              <w:rPr>
+                <w:rFonts w:ascii="Times New Roman" w:eastAsia="Times New Roman" w:hAnsi="Times New Roman" w:cs="Times New Roman"/>
+                <w:sz w:val="24"/>
+                <w:szCs w:val="24"/>
+              </w:rPr>
+            </w:pPr>
+            <w:r>
+              <w:rPr>
+                <w:rFonts w:ascii="Times New Roman" w:eastAsia="Times New Roman" w:hAnsi="Times New Roman" w:cs="Times New Roman"/>
+                <w:sz w:val="24"/>
+                <w:szCs w:val="24"/>
+              </w:rPr>
+              <w:t>ASP.NET Core Web API (C#)</w:t>
+            </w:r>
+          </w:p>
+        </w:tc>
+      </w:tr>
+      <w:tr>
+        <w:trPr>
+          <w:tblCellSpacing w:w="15" w:type="dxa"/>
+        </w:trPr>
+        <w:tc>
+          <w:tcPr>
+            <w:tcW w:w="1935" w:type="dxa"/>
+            <w:vAlign w:val="center"/>
+          </w:tcPr>
+          <w:p>
+            <w:pPr>
+              <w:spacing w:after="0" w:line="240" w:lineRule="auto"/>
+              <w:rPr>
+                <w:rFonts w:ascii="Times New Roman" w:eastAsia="Times New Roman" w:hAnsi="Times New Roman" w:cs="Times New Roman"/>
+                <w:sz w:val="24"/>
+                <w:szCs w:val="24"/>
+                <w:lang w:val="vi-VN"/>
+              </w:rPr>
+            </w:pPr>
+            <w:r>
+              <w:rPr>
+                <w:rFonts w:ascii="Times New Roman" w:eastAsia="Times New Roman" w:hAnsi="Times New Roman" w:cs="Times New Roman"/>
+                <w:sz w:val="24"/>
+                <w:szCs w:val="24"/>
+              </w:rPr>
+              <w:t>Viết</w:t>
+            </w:r>
+            <w:r>
+              <w:rPr>
+                <w:rFonts w:ascii="Times New Roman" w:eastAsia="Times New Roman" w:hAnsi="Times New Roman" w:cs="Times New Roman"/>
+                <w:sz w:val="24"/>
+                <w:szCs w:val="24"/>
+                <w:lang w:val="vi-VN"/>
+              </w:rPr>
+              <w:t xml:space="preserve"> API liên quan đến load dữ liệu danh sách bác sĩ</w:t>
+            </w:r>
+          </w:p>
+        </w:tc>
+        <w:tc>
+          <w:tcPr>
+            <w:tcW w:w="2663" w:type="dxa"/>
+            <w:vAlign w:val="center"/>
+          </w:tcPr>
+          <w:p>
+            <w:pPr>
+              <w:spacing w:after="0" w:line="240" w:lineRule="auto"/>
+              <w:rPr>
+                <w:rFonts w:ascii="Times New Roman" w:eastAsia="Times New Roman" w:hAnsi="Times New Roman" w:cs="Times New Roman"/>
+                <w:sz w:val="24"/>
+                <w:szCs w:val="24"/>
+                <w:lang w:val="vi-VN"/>
+              </w:rPr>
+            </w:pPr>
+            <w:r>
+              <w:rPr>
+                <w:rFonts w:ascii="Times New Roman" w:eastAsia="Times New Roman" w:hAnsi="Times New Roman" w:cs="Times New Roman"/>
+                <w:sz w:val="24"/>
+                <w:szCs w:val="24"/>
+              </w:rPr>
+              <w:t>Quốc</w:t>
+            </w:r>
+            <w:r>
+              <w:rPr>
+                <w:rFonts w:ascii="Times New Roman" w:eastAsia="Times New Roman" w:hAnsi="Times New Roman" w:cs="Times New Roman"/>
+                <w:sz w:val="24"/>
+                <w:szCs w:val="24"/>
+                <w:lang w:val="vi-VN"/>
+              </w:rPr>
+              <w:t xml:space="preserve"> Hưng</w:t>
+            </w:r>
+          </w:p>
+        </w:tc>
+        <w:tc>
+          <w:tcPr>
+            <w:tcW w:w="1388" w:type="dxa"/>
+            <w:vAlign w:val="center"/>
+          </w:tcPr>
+          <w:p>
+            <w:pPr>
+              <w:spacing w:after="0" w:line="240" w:lineRule="auto"/>
+              <w:rPr>
+                <w:rFonts w:ascii="Times New Roman" w:eastAsia="Times New Roman" w:hAnsi="Times New Roman" w:cs="Times New Roman"/>
+                <w:sz w:val="24"/>
+                <w:szCs w:val="24"/>
+                <w:lang w:val="vi-VN"/>
+              </w:rPr>
+            </w:pPr>
+            <w:r>
+              <w:rPr>
+                <w:rFonts w:ascii="Times New Roman" w:eastAsia="Times New Roman" w:hAnsi="Times New Roman" w:cs="Times New Roman"/>
+                <w:sz w:val="24"/>
+                <w:szCs w:val="24"/>
+                <w:lang w:val="vi-VN"/>
+              </w:rPr>
+              <w:t>30/9/2025</w:t>
+            </w:r>
+          </w:p>
+        </w:tc>
+        <w:tc>
+          <w:tcPr>
+            <w:tcW w:w="2790" w:type="dxa"/>
+            <w:vAlign w:val="center"/>
+          </w:tcPr>
+          <w:p>
+            <w:pPr>
+              <w:spacing w:after="0" w:line="240" w:lineRule="auto"/>
+              <w:rPr>
+                <w:rFonts w:ascii="Times New Roman" w:eastAsia="Times New Roman" w:hAnsi="Times New Roman" w:cs="Times New Roman"/>
+                <w:sz w:val="24"/>
+                <w:szCs w:val="24"/>
+              </w:rPr>
+            </w:pPr>
+            <w:r>
+              <w:rPr>
+                <w:rFonts w:ascii="Times New Roman" w:eastAsia="Times New Roman" w:hAnsi="Times New Roman" w:cs="Times New Roman"/>
+                <w:sz w:val="24"/>
+                <w:szCs w:val="24"/>
+              </w:rPr>
+              <w:t>ASP.NET Core Web API (C#)</w:t>
+            </w:r>
+          </w:p>
+        </w:tc>
+      </w:tr>
+      <w:tr>
+        <w:trPr>
+          <w:tblCellSpacing w:w="15" w:type="dxa"/>
+        </w:trPr>
+        <w:tc>
+          <w:tcPr>
+            <w:tcW w:w="1935" w:type="dxa"/>
+            <w:vAlign w:val="center"/>
+          </w:tcPr>
+          <w:p>
+            <w:pPr>
+              <w:spacing w:after="0" w:line="240" w:lineRule="auto"/>
+              <w:rPr>
+                <w:rFonts w:ascii="Times New Roman" w:eastAsia="Times New Roman" w:hAnsi="Times New Roman" w:cs="Times New Roman"/>
+                <w:sz w:val="24"/>
+                <w:szCs w:val="24"/>
+                <w:lang w:val="vi-VN"/>
+              </w:rPr>
+            </w:pPr>
+            <w:r>
+              <w:rPr>
+                <w:rFonts w:ascii="Times New Roman" w:eastAsia="Times New Roman" w:hAnsi="Times New Roman" w:cs="Times New Roman"/>
+                <w:sz w:val="24"/>
+                <w:szCs w:val="24"/>
+              </w:rPr>
+              <w:t>Viết</w:t>
+            </w:r>
+            <w:r>
+              <w:rPr>
+                <w:rFonts w:ascii="Times New Roman" w:eastAsia="Times New Roman" w:hAnsi="Times New Roman" w:cs="Times New Roman"/>
+                <w:sz w:val="24"/>
+                <w:szCs w:val="24"/>
+                <w:lang w:val="vi-VN"/>
+              </w:rPr>
+              <w:t xml:space="preserve"> API liên quan đến load dữ liệu danh sách chuyên khoa</w:t>
+            </w:r>
+          </w:p>
+        </w:tc>
+        <w:tc>
+          <w:tcPr>
+            <w:tcW w:w="2663" w:type="dxa"/>
+            <w:vAlign w:val="center"/>
+          </w:tcPr>
+          <w:p>
+            <w:pPr>
+              <w:spacing w:after="0" w:line="240" w:lineRule="auto"/>
+              <w:rPr>
+                <w:rFonts w:ascii="Times New Roman" w:eastAsia="Times New Roman" w:hAnsi="Times New Roman" w:cs="Times New Roman"/>
+                <w:sz w:val="24"/>
+                <w:szCs w:val="24"/>
+                <w:lang w:val="vi-VN"/>
+              </w:rPr>
+            </w:pPr>
+            <w:r>
+              <w:rPr>
+                <w:rFonts w:ascii="Times New Roman" w:eastAsia="Times New Roman" w:hAnsi="Times New Roman" w:cs="Times New Roman"/>
+                <w:sz w:val="24"/>
+                <w:szCs w:val="24"/>
+              </w:rPr>
+              <w:t>Quốc</w:t>
+            </w:r>
+            <w:r>
+              <w:rPr>
+                <w:rFonts w:ascii="Times New Roman" w:eastAsia="Times New Roman" w:hAnsi="Times New Roman" w:cs="Times New Roman"/>
+                <w:sz w:val="24"/>
+                <w:szCs w:val="24"/>
+                <w:lang w:val="vi-VN"/>
+              </w:rPr>
+              <w:t xml:space="preserve"> Hưng</w:t>
+            </w:r>
+          </w:p>
+        </w:tc>
+        <w:tc>
+          <w:tcPr>
+            <w:tcW w:w="1388" w:type="dxa"/>
+            <w:vAlign w:val="center"/>
+          </w:tcPr>
+          <w:p>
+            <w:pPr>
+              <w:spacing w:after="0" w:line="240" w:lineRule="auto"/>
+              <w:rPr>
+                <w:rFonts w:ascii="Times New Roman" w:eastAsia="Times New Roman" w:hAnsi="Times New Roman" w:cs="Times New Roman"/>
+                <w:sz w:val="24"/>
+                <w:szCs w:val="24"/>
+                <w:lang w:val="vi-VN"/>
+              </w:rPr>
+            </w:pPr>
+            <w:r>
+              <w:rPr>
+                <w:rFonts w:ascii="Times New Roman" w:eastAsia="Times New Roman" w:hAnsi="Times New Roman" w:cs="Times New Roman"/>
+                <w:sz w:val="24"/>
+                <w:szCs w:val="24"/>
+                <w:lang w:val="vi-VN"/>
+              </w:rPr>
+              <w:t>30/9/2025</w:t>
+            </w:r>
+          </w:p>
+        </w:tc>
+        <w:tc>
+          <w:tcPr>
+            <w:tcW w:w="2790" w:type="dxa"/>
+            <w:vAlign w:val="center"/>
+          </w:tcPr>
+          <w:p>
+            <w:pPr>
+              <w:spacing w:after="0" w:line="240" w:lineRule="auto"/>
+              <w:rPr>
+                <w:rFonts w:ascii="Times New Roman" w:eastAsia="Times New Roman" w:hAnsi="Times New Roman" w:cs="Times New Roman"/>
+                <w:sz w:val="24"/>
+                <w:szCs w:val="24"/>
+              </w:rPr>
+            </w:pPr>
+            <w:r>
+              <w:rPr>
+                <w:rFonts w:ascii="Times New Roman" w:eastAsia="Times New Roman" w:hAnsi="Times New Roman" w:cs="Times New Roman"/>
+                <w:sz w:val="24"/>
+                <w:szCs w:val="24"/>
+              </w:rPr>
+              <w:t>ASP.NET Core Web API (C#)</w:t>
+            </w:r>
+          </w:p>
+        </w:tc>
+      </w:tr>
+      <w:tr>
+        <w:trPr>
+          <w:tblCellSpacing w:w="15" w:type="dxa"/>
+        </w:trPr>
+        <w:tc>
+          <w:tcPr>
+            <w:tcW w:w="1935" w:type="dxa"/>
+            <w:vAlign w:val="center"/>
+          </w:tcPr>
+          <w:p>
+            <w:pPr>
+              <w:spacing w:after="0" w:line="240" w:lineRule="auto"/>
+              <w:rPr>
+                <w:rFonts w:ascii="Times New Roman" w:eastAsia="Times New Roman" w:hAnsi="Times New Roman" w:cs="Times New Roman"/>
+                <w:sz w:val="24"/>
+                <w:szCs w:val="24"/>
+                <w:lang w:val="vi-VN"/>
+              </w:rPr>
+            </w:pPr>
+            <w:r>
+              <w:rPr>
+                <w:rFonts w:ascii="Times New Roman" w:eastAsia="Times New Roman" w:hAnsi="Times New Roman" w:cs="Times New Roman"/>
+                <w:sz w:val="24"/>
+                <w:szCs w:val="24"/>
+              </w:rPr>
+              <w:t>Viết</w:t>
+            </w:r>
+            <w:r>
+              <w:rPr>
+                <w:rFonts w:ascii="Times New Roman" w:eastAsia="Times New Roman" w:hAnsi="Times New Roman" w:cs="Times New Roman"/>
+                <w:sz w:val="24"/>
+                <w:szCs w:val="24"/>
+                <w:lang w:val="vi-VN"/>
+              </w:rPr>
+              <w:t xml:space="preserve"> API liên quan đến xử lý dữ liệu đăng ký lịch khám</w:t>
+            </w:r>
+          </w:p>
+        </w:tc>
+        <w:tc>
+          <w:tcPr>
+            <w:tcW w:w="2663" w:type="dxa"/>
+            <w:vAlign w:val="center"/>
+          </w:tcPr>
+          <w:p>
+            <w:pPr>
+              <w:spacing w:after="0" w:line="240" w:lineRule="auto"/>
+              <w:rPr>
+                <w:rFonts w:ascii="Times New Roman" w:eastAsia="Times New Roman" w:hAnsi="Times New Roman" w:cs="Times New Roman"/>
+                <w:sz w:val="24"/>
+                <w:szCs w:val="24"/>
+                <w:lang w:val="vi-VN"/>
+              </w:rPr>
+            </w:pPr>
+            <w:r>
+              <w:rPr>
+                <w:rFonts w:ascii="Times New Roman" w:eastAsia="Times New Roman" w:hAnsi="Times New Roman" w:cs="Times New Roman"/>
+                <w:sz w:val="24"/>
+                <w:szCs w:val="24"/>
+              </w:rPr>
+              <w:t>Quốc</w:t>
+            </w:r>
+            <w:r>
+              <w:rPr>
+                <w:rFonts w:ascii="Times New Roman" w:eastAsia="Times New Roman" w:hAnsi="Times New Roman" w:cs="Times New Roman"/>
+                <w:sz w:val="24"/>
+                <w:szCs w:val="24"/>
+                <w:lang w:val="vi-VN"/>
+              </w:rPr>
+              <w:t xml:space="preserve"> Hưng</w:t>
+            </w:r>
+          </w:p>
+        </w:tc>
+        <w:tc>
+          <w:tcPr>
+            <w:tcW w:w="1388" w:type="dxa"/>
+            <w:vAlign w:val="center"/>
+          </w:tcPr>
+          <w:p>
+            <w:pPr>
+              <w:spacing w:after="0" w:line="240" w:lineRule="auto"/>
+              <w:rPr>
+                <w:rFonts w:ascii="Times New Roman" w:eastAsia="Times New Roman" w:hAnsi="Times New Roman" w:cs="Times New Roman"/>
+                <w:sz w:val="24"/>
+                <w:szCs w:val="24"/>
+                <w:lang w:val="vi-VN"/>
+              </w:rPr>
+            </w:pPr>
+            <w:r>
+              <w:rPr>
+                <w:rFonts w:ascii="Times New Roman" w:eastAsia="Times New Roman" w:hAnsi="Times New Roman" w:cs="Times New Roman"/>
+                <w:sz w:val="24"/>
+                <w:szCs w:val="24"/>
+                <w:lang w:val="vi-VN"/>
+              </w:rPr>
+              <w:t>30/9/2025</w:t>
+            </w:r>
+          </w:p>
+        </w:tc>
+        <w:tc>
+          <w:tcPr>
+            <w:tcW w:w="2790" w:type="dxa"/>
+            <w:vAlign w:val="center"/>
+          </w:tcPr>
+          <w:p>
+            <w:pPr>
+              <w:spacing w:after="0" w:line="240" w:lineRule="auto"/>
+              <w:rPr>
+                <w:rFonts w:ascii="Times New Roman" w:eastAsia="Times New Roman" w:hAnsi="Times New Roman" w:cs="Times New Roman"/>
+                <w:sz w:val="24"/>
+                <w:szCs w:val="24"/>
+              </w:rPr>
+            </w:pPr>
+            <w:r>
+              <w:rPr>
+                <w:rFonts w:ascii="Times New Roman" w:eastAsia="Times New Roman" w:hAnsi="Times New Roman" w:cs="Times New Roman"/>
+                <w:sz w:val="24"/>
+                <w:szCs w:val="24"/>
+              </w:rPr>
+              <w:t>ASP.NET Core Web API (C#)</w:t>
+            </w:r>
+          </w:p>
+        </w:tc>
+      </w:tr>
+      <w:tr>
+        <w:trPr>
+          <w:tblCellSpacing w:w="15" w:type="dxa"/>
+        </w:trPr>
+        <w:tc>
+          <w:tcPr>
+            <w:tcW w:w="1935" w:type="dxa"/>
+            <w:vAlign w:val="center"/>
+          </w:tcPr>
+          <w:p>
+            <w:pPr>
+              <w:spacing w:after="0" w:line="240" w:lineRule="auto"/>
+              <w:rPr>
+                <w:rFonts w:ascii="Times New Roman" w:eastAsia="Times New Roman" w:hAnsi="Times New Roman" w:cs="Times New Roman"/>
+                <w:sz w:val="24"/>
+                <w:szCs w:val="24"/>
+                <w:lang w:val="vi-VN"/>
+              </w:rPr>
+            </w:pPr>
+            <w:r>
+              <w:rPr>
+                <w:rFonts w:ascii="Times New Roman" w:eastAsia="Times New Roman" w:hAnsi="Times New Roman" w:cs="Times New Roman"/>
+                <w:sz w:val="24"/>
+                <w:szCs w:val="24"/>
+              </w:rPr>
+              <w:t>Thiết</w:t>
+            </w:r>
+            <w:r>
+              <w:rPr>
+                <w:rFonts w:ascii="Times New Roman" w:eastAsia="Times New Roman" w:hAnsi="Times New Roman" w:cs="Times New Roman"/>
+                <w:sz w:val="24"/>
+                <w:szCs w:val="24"/>
+                <w:lang w:val="vi-VN"/>
+              </w:rPr>
+              <w:t xml:space="preserve"> kế Database cho Project</w:t>
+            </w:r>
+          </w:p>
+        </w:tc>
+        <w:tc>
+          <w:tcPr>
+            <w:tcW w:w="2663" w:type="dxa"/>
+            <w:vAlign w:val="center"/>
+          </w:tcPr>
+          <w:p>
+            <w:pPr>
+              <w:spacing w:after="0" w:line="240" w:lineRule="auto"/>
+              <w:rPr>
+                <w:rFonts w:ascii="Times New Roman" w:eastAsia="Times New Roman" w:hAnsi="Times New Roman" w:cs="Times New Roman"/>
+                <w:sz w:val="24"/>
+                <w:szCs w:val="24"/>
+                <w:lang w:val="vi-VN"/>
+              </w:rPr>
+            </w:pPr>
+            <w:r>
+              <w:rPr>
+                <w:rFonts w:ascii="Times New Roman" w:eastAsia="Times New Roman" w:hAnsi="Times New Roman" w:cs="Times New Roman"/>
+                <w:sz w:val="24"/>
+                <w:szCs w:val="24"/>
+              </w:rPr>
+              <w:t>Quốc</w:t>
+            </w:r>
+            <w:r>
+              <w:rPr>
+                <w:rFonts w:ascii="Times New Roman" w:eastAsia="Times New Roman" w:hAnsi="Times New Roman" w:cs="Times New Roman"/>
+                <w:sz w:val="24"/>
+                <w:szCs w:val="24"/>
+                <w:lang w:val="vi-VN"/>
+              </w:rPr>
+              <w:t xml:space="preserve"> Hưng</w:t>
+            </w:r>
+          </w:p>
+        </w:tc>
+        <w:tc>
+          <w:tcPr>
+            <w:tcW w:w="1388" w:type="dxa"/>
+            <w:vAlign w:val="center"/>
+          </w:tcPr>
+          <w:p>
+            <w:pPr>
+              <w:spacing w:after="0" w:line="240" w:lineRule="auto"/>
+              <w:rPr>
+                <w:rFonts w:ascii="Times New Roman" w:eastAsia="Times New Roman" w:hAnsi="Times New Roman" w:cs="Times New Roman"/>
+                <w:sz w:val="24"/>
+                <w:szCs w:val="24"/>
+                <w:lang w:val="vi-VN"/>
+              </w:rPr>
+            </w:pPr>
+            <w:r>
+              <w:rPr>
+                <w:rFonts w:ascii="Times New Roman" w:eastAsia="Times New Roman" w:hAnsi="Times New Roman" w:cs="Times New Roman"/>
+                <w:sz w:val="24"/>
+                <w:szCs w:val="24"/>
+                <w:lang w:val="vi-VN"/>
+              </w:rPr>
+              <w:t>30/9/2025</w:t>
+            </w:r>
+          </w:p>
+        </w:tc>
+        <w:tc>
+          <w:tcPr>
+            <w:tcW w:w="2790" w:type="dxa"/>
+            <w:vAlign w:val="center"/>
+          </w:tcPr>
+          <w:p>
+            <w:pPr>
+              <w:spacing w:after="0" w:line="240" w:lineRule="auto"/>
+              <w:rPr>
+                <w:rFonts w:ascii="Times New Roman" w:eastAsia="Times New Roman" w:hAnsi="Times New Roman" w:cs="Times New Roman"/>
+                <w:sz w:val="24"/>
+                <w:szCs w:val="24"/>
+              </w:rPr>
+            </w:pPr>
+            <w:r>
+              <w:rPr>
+                <w:rFonts w:ascii="Times New Roman" w:eastAsia="Times New Roman" w:hAnsi="Times New Roman" w:cs="Times New Roman"/>
+                <w:sz w:val="24"/>
+                <w:szCs w:val="24"/>
+              </w:rPr>
+              <w:t>SQL Server</w:t>
             </w:r>
           </w:p>
         </w:tc>
@@ -2920,6 +3764,35 @@
           <w:bCs/>
           <w:sz w:val="27"/>
           <w:szCs w:val="27"/>
+          <w:lang w:val="vi-VN"/>
+        </w:rPr>
+      </w:pPr>
+    </w:p>
+    <w:p>
+      <w:pPr>
+        <w:spacing w:before="100" w:beforeAutospacing="1" w:after="100" w:afterAutospacing="1" w:line="240" w:lineRule="auto"/>
+        <w:outlineLvl w:val="2"/>
+        <w:rPr>
+          <w:rFonts w:ascii="Times New Roman" w:eastAsia="Times New Roman" w:hAnsi="Times New Roman" w:cs="Times New Roman"/>
+          <w:b/>
+          <w:bCs/>
+          <w:sz w:val="27"/>
+          <w:szCs w:val="27"/>
+          <w:lang w:val="vi-VN"/>
+        </w:rPr>
+      </w:pPr>
+    </w:p>
+    <w:p>
+      <w:pPr>
+        <w:spacing w:before="100" w:beforeAutospacing="1" w:after="100" w:afterAutospacing="1" w:line="240" w:lineRule="auto"/>
+        <w:outlineLvl w:val="2"/>
+        <w:rPr>
+          <w:rFonts w:ascii="Times New Roman" w:eastAsia="Times New Roman" w:hAnsi="Times New Roman" w:cs="Times New Roman"/>
+          <w:b/>
+          <w:bCs/>
+          <w:sz w:val="27"/>
+          <w:szCs w:val="27"/>
+          <w:lang w:val="vi-VN"/>
         </w:rPr>
       </w:pPr>
       <w:r>
@@ -2929,7 +3802,9 @@
           <w:bCs/>
           <w:sz w:val="27"/>
           <w:szCs w:val="27"/>
+          <w:lang w:val="vi-VN"/>
         </w:rPr>
+        <w:lastRenderedPageBreak/>
         <w:t>4. Rủi ro và biện pháp</w:t>
       </w:r>
     </w:p>

</xml_diff>